<commit_message>
changed doctor spelling to practitioner in files
</commit_message>
<xml_diff>
--- a/week4/Stage_1_Lab_Student_Handout.docx
+++ b/week4/Stage_1_Lab_Student_Handout.docx
@@ -154,7 +154,10 @@
         <w:t xml:space="preserve">Patient name, the </w:t>
       </w:r>
       <w:r>
-        <w:t>doctor’s name</w:t>
+        <w:t xml:space="preserve">practitioners </w:t>
+      </w:r>
+      <w:r>
+        <w:t xml:space="preserve"> name</w:t>
       </w:r>
       <w:r>
         <w:t>, and the time slot of appointment</w:t>
@@ -232,7 +235,21 @@
     </w:p>
     <w:p>
       <w:r>
-        <w:t>We don’t know who can manage appointments, what doctors or specialists are on duty, how data will be stored.</w:t>
+        <w:t xml:space="preserve">We don’t know who can manage appointments, what </w:t>
+      </w:r>
+      <w:r>
+        <w:t xml:space="preserve">practitioners  </w:t>
+      </w:r>
+      <w:r>
+        <w:t>or specialists are on duty</w:t>
+      </w:r>
+      <w:proofErr w:type="gramStart"/>
+      <w:r>
+        <w:t>, how</w:t>
+      </w:r>
+      <w:proofErr w:type="gramEnd"/>
+      <w:r>
+        <w:t xml:space="preserve"> data will be stored.</w:t>
       </w:r>
     </w:p>
     <w:p>
@@ -417,6 +434,7 @@
           <w:b/>
           <w:bCs/>
         </w:rPr>
+        <w:lastRenderedPageBreak/>
         <w:t>appointment1_time = '2024-07-20 10:00 AM'</w:t>
       </w:r>
     </w:p>
@@ -435,7 +453,6 @@
           <w:b/>
           <w:bCs/>
         </w:rPr>
-        <w:lastRenderedPageBreak/>
         <w:t>print</w:t>
       </w:r>
       <w:proofErr w:type="gramStart"/>
@@ -1652,13 +1669,7 @@
     </w:p>
     <w:p>
       <w:r>
-        <w:t xml:space="preserve">Limitation </w:t>
-      </w:r>
-      <w:r>
-        <w:t>4</w:t>
-      </w:r>
-      <w:r>
-        <w:t xml:space="preserve">: </w:t>
+        <w:t xml:space="preserve">Limitation 4: </w:t>
       </w:r>
       <w:r>
         <w:t>No validation checks for date and time. This will produce errors if input incorrectly.</w:t>
@@ -1667,13 +1678,7 @@
     <w:p>
       <w:r>
         <w:lastRenderedPageBreak/>
-        <w:t xml:space="preserve">Limitation </w:t>
-      </w:r>
-      <w:r>
-        <w:t>5</w:t>
-      </w:r>
-      <w:r>
-        <w:t xml:space="preserve">: </w:t>
+        <w:t xml:space="preserve">Limitation 5: </w:t>
       </w:r>
       <w:r>
         <w:t xml:space="preserve">Only checks name is a string and not if that </w:t>
@@ -2214,19 +2219,14 @@
         </w:rPr>
         <w:t xml:space="preserve">, </w:t>
       </w:r>
-      <w:proofErr w:type="spellStart"/>
-      <w:r>
-        <w:rPr>
-          <w:lang w:val="en-AU"/>
-        </w:rPr>
-        <w:t>doctor_name</w:t>
-      </w:r>
-      <w:proofErr w:type="spellEnd"/>
-      <w:r>
-        <w:rPr>
-          <w:lang w:val="en-AU"/>
-        </w:rPr>
-        <w:t xml:space="preserve">, </w:t>
+      <w:r>
+        <w:t>practitioners</w:t>
+      </w:r>
+      <w:r>
+        <w:rPr>
+          <w:lang w:val="en-AU"/>
+        </w:rPr>
+        <w:t xml:space="preserve">_name, </w:t>
       </w:r>
       <w:proofErr w:type="spellStart"/>
       <w:r>
@@ -2296,21 +2296,28 @@
         <w:rPr>
           <w:lang w:val="en-AU"/>
         </w:rPr>
-        <w:t xml:space="preserve">"doctor": </w:t>
-      </w:r>
-      <w:proofErr w:type="spellStart"/>
-      <w:r>
-        <w:rPr>
-          <w:lang w:val="en-AU"/>
-        </w:rPr>
-        <w:t>doctor_name</w:t>
-      </w:r>
-      <w:proofErr w:type="spellEnd"/>
-      <w:r>
-        <w:rPr>
-          <w:lang w:val="en-AU"/>
-        </w:rPr>
-        <w:t>,</w:t>
+        <w:t>"</w:t>
+      </w:r>
+      <w:r>
+        <w:t xml:space="preserve"> </w:t>
+      </w:r>
+      <w:r>
+        <w:t>practitioner</w:t>
+      </w:r>
+      <w:r>
+        <w:rPr>
+          <w:lang w:val="en-AU"/>
+        </w:rPr>
+        <w:t xml:space="preserve">": </w:t>
+      </w:r>
+      <w:r>
+        <w:t>practitioner</w:t>
+      </w:r>
+      <w:r>
+        <w:rPr>
+          <w:lang w:val="en-AU"/>
+        </w:rPr>
+        <w:t>_name,</w:t>
       </w:r>
     </w:p>
     <w:p>
@@ -2549,19 +2556,32 @@
           <w:lang w:val="en-AU"/>
         </w:rPr>
       </w:pPr>
-      <w:proofErr w:type="spellStart"/>
-      <w:r>
-        <w:rPr>
-          <w:lang w:val="en-AU"/>
-        </w:rPr>
-        <w:t>f"Doctor</w:t>
-      </w:r>
-      <w:proofErr w:type="spellEnd"/>
-      <w:r>
-        <w:rPr>
-          <w:lang w:val="en-AU"/>
-        </w:rPr>
-        <w:t>: {appt['doctor']}, "</w:t>
+      <w:r>
+        <w:rPr>
+          <w:lang w:val="en-AU"/>
+        </w:rPr>
+        <w:t>f"</w:t>
+      </w:r>
+      <w:r>
+        <w:t xml:space="preserve"> </w:t>
+      </w:r>
+      <w:r>
+        <w:t>practitioner</w:t>
+      </w:r>
+      <w:r>
+        <w:rPr>
+          <w:lang w:val="en-AU"/>
+        </w:rPr>
+        <w:t>: {appt[</w:t>
+      </w:r>
+      <w:r>
+        <w:t>practitioner</w:t>
+      </w:r>
+      <w:r>
+        <w:rPr>
+          <w:lang w:val="en-AU"/>
+        </w:rPr>
+        <w:t>]}, "</w:t>
       </w:r>
     </w:p>
     <w:p>
@@ -2803,10 +2823,10 @@
               <w:t xml:space="preserve">Yes, it assumed you know available times and the </w:t>
             </w:r>
             <w:r>
-              <w:t>doctor’s</w:t>
+              <w:t xml:space="preserve">practitioners  </w:t>
             </w:r>
             <w:r>
-              <w:t xml:space="preserve"> names.</w:t>
+              <w:t>names.</w:t>
             </w:r>
           </w:p>
         </w:tc>
@@ -2979,6 +2999,9 @@
         <w:ind w:left="360" w:hanging="360"/>
       </w:pPr>
       <w:r>
+        <w:rPr>
+          <w:noProof/>
+        </w:rPr>
         <w:lastRenderedPageBreak/>
         <w:drawing>
           <wp:inline distT="0" distB="0" distL="0" distR="0" wp14:anchorId="4ACCBF96" wp14:editId="37A29302">
@@ -3129,7 +3152,16 @@
     <w:p>
       <w:r>
         <w:lastRenderedPageBreak/>
-        <w:t>A simple program that used functions to add patient name, doctor name, and appointment time</w:t>
+        <w:t xml:space="preserve">A simple program that used functions to add patient name, </w:t>
+      </w:r>
+      <w:r>
+        <w:t>practitioner</w:t>
+      </w:r>
+      <w:r>
+        <w:t xml:space="preserve"> </w:t>
+      </w:r>
+      <w:r>
+        <w:t>name, and appointment time</w:t>
       </w:r>
       <w:r>
         <w:t>. That data was then put into a list then printed at the end. Nothing is saved permanently and no checks are done except for name check if the line is empty. So many things are bound to go wrong as human error is always a probability.</w:t>
@@ -5872,6 +5904,7 @@
   <w:style w:type="character" w:default="1" w:styleId="DefaultParagraphFont">
     <w:name w:val="Default Paragraph Font"/>
     <w:uiPriority w:val="1"/>
+    <w:semiHidden/>
     <w:unhideWhenUsed/>
   </w:style>
   <w:style w:type="table" w:default="1" w:styleId="TableNormal">

</xml_diff>